<commit_message>
xoa bai 3 lap 7
</commit_message>
<xml_diff>
--- a/Buoi7_NguyenHoTruongTam_11CNPM2/bai2.1/bai2.1.docx
+++ b/Buoi7_NguyenHoTruongTam_11CNPM2/bai2.1/bai2.1.docx
@@ -3,12 +3,36 @@
 <w:document xmlns:wpc="http://schemas.microsoft.com/office/word/2010/wordprocessingCanvas" xmlns:cx="http://schemas.microsoft.com/office/drawing/2014/chartex" xmlns:cx1="http://schemas.microsoft.com/office/drawing/2015/9/8/chartex" xmlns:cx2="http://schemas.microsoft.com/office/drawing/2015/10/21/chartex" xmlns:cx3="http://schemas.microsoft.com/office/drawing/2016/5/9/chartex" xmlns:cx4="http://schemas.microsoft.com/office/drawing/2016/5/10/chartex" xmlns:cx5="http://schemas.microsoft.com/office/drawing/2016/5/11/chartex" xmlns:cx6="http://schemas.microsoft.com/office/drawing/2016/5/12/chartex" xmlns:cx7="http://schemas.microsoft.com/office/drawing/2016/5/13/chartex" xmlns:cx8="http://schemas.microsoft.com/office/drawing/2016/5/14/chartex" xmlns:mc="http://schemas.openxmlformats.org/markup-compatibility/2006" xmlns:aink="http://schemas.microsoft.com/office/drawing/2016/ink" xmlns:am3d="http://schemas.microsoft.com/office/drawing/2017/model3d" xmlns:o="urn:schemas-microsoft-com:office:office" xmlns:oel="http://schemas.microsoft.com/office/2019/extlst" xmlns:r="http://schemas.openxmlformats.org/officeDocument/2006/relationships" xmlns:m="http://schemas.openxmlformats.org/officeDocument/2006/math" xmlns:v="urn:schemas-microsoft-com:vml" xmlns:wp14="http://schemas.microsoft.com/office/word/2010/wordprocessingDrawing" xmlns:wp="http://schemas.openxmlformats.org/drawingml/2006/wordprocessingDrawing" xmlns:w10="urn:schemas-microsoft-com:office:word" xmlns:w="http://schemas.openxmlformats.org/wordprocessingml/2006/main" xmlns:w14="http://schemas.microsoft.com/office/word/2010/wordml" xmlns:w15="http://schemas.microsoft.com/office/word/2012/wordml" xmlns:w16cex="http://schemas.microsoft.com/office/word/2018/wordml/cex" xmlns:w16cid="http://schemas.microsoft.com/office/word/2016/wordml/cid" xmlns:w16="http://schemas.microsoft.com/office/word/2018/wordml" xmlns:w16du="http://schemas.microsoft.com/office/word/2023/wordml/word16du" xmlns:w16sdtdh="http://schemas.microsoft.com/office/word/2020/wordml/sdtdatahash" xmlns:w16sdtfl="http://schemas.microsoft.com/office/word/2024/wordml/sdtformatlock" xmlns:w16se="http://schemas.microsoft.com/office/word/2015/wordml/symex" xmlns:wpg="http://schemas.microsoft.com/office/word/2010/wordprocessingGroup" xmlns:wpi="http://schemas.microsoft.com/office/word/2010/wordprocessingInk" xmlns:wne="http://schemas.microsoft.com/office/word/2006/wordml" xmlns:wps="http://schemas.microsoft.com/office/word/2010/wordprocessingShape" mc:Ignorable="w14 w15 w16se w16cid w16 w16cex w16sdtdh w16sdtfl w16du wp14">
   <w:body>
     <w:p>
-      <w:r>
+      <w:pPr>
+        <w:rPr>
+          <w:b/>
+          <w:bCs/>
+          <w:color w:val="EE0000"/>
+        </w:rPr>
+      </w:pPr>
+      <w:r>
+        <w:rPr>
+          <w:b/>
+          <w:bCs/>
+          <w:color w:val="EE0000"/>
+        </w:rPr>
         <w:t>Nguyễn Hồ Trường Tam_1150080156_11CNPM2</w:t>
       </w:r>
     </w:p>
     <w:p>
-      <w:r>
+      <w:pPr>
+        <w:rPr>
+          <w:b/>
+          <w:bCs/>
+          <w:color w:val="EE0000"/>
+        </w:rPr>
+      </w:pPr>
+      <w:r>
+        <w:rPr>
+          <w:b/>
+          <w:bCs/>
+          <w:color w:val="EE0000"/>
+        </w:rPr>
         <w:t>Bai2.1</w:t>
       </w:r>
     </w:p>
@@ -19,6 +43,9 @@
     </w:p>
     <w:p>
       <w:r>
+        <w:rPr>
+          <w:noProof/>
+        </w:rPr>
         <w:drawing>
           <wp:inline distT="0" distB="0" distL="0" distR="0" wp14:anchorId="06CA7CB6" wp14:editId="168C5C8D">
             <wp:extent cx="5731510" cy="3079750"/>
@@ -58,6 +85,9 @@
     </w:p>
     <w:p>
       <w:r>
+        <w:rPr>
+          <w:noProof/>
+        </w:rPr>
         <w:drawing>
           <wp:inline distT="0" distB="0" distL="0" distR="0" wp14:anchorId="7E365C0B" wp14:editId="5BC413F6">
             <wp:extent cx="5731510" cy="3504565"/>
@@ -106,6 +136,9 @@
     </w:p>
     <w:p>
       <w:r>
+        <w:rPr>
+          <w:noProof/>
+        </w:rPr>
         <w:drawing>
           <wp:inline distT="0" distB="0" distL="0" distR="0" wp14:anchorId="22AE5C4A" wp14:editId="57F30A9D">
             <wp:extent cx="5731510" cy="5897880"/>
@@ -150,6 +183,9 @@
     </w:p>
     <w:p>
       <w:r>
+        <w:rPr>
+          <w:noProof/>
+        </w:rPr>
         <w:drawing>
           <wp:inline distT="0" distB="0" distL="0" distR="0" wp14:anchorId="0D46B561" wp14:editId="51EA1298">
             <wp:extent cx="5731510" cy="1446530"/>
@@ -198,6 +234,9 @@
     </w:p>
     <w:p>
       <w:r>
+        <w:rPr>
+          <w:noProof/>
+        </w:rPr>
         <w:drawing>
           <wp:inline distT="0" distB="0" distL="0" distR="0" wp14:anchorId="3E55F1FC" wp14:editId="7E351130">
             <wp:extent cx="5731510" cy="5272405"/>
@@ -242,6 +281,9 @@
     </w:p>
     <w:p>
       <w:r>
+        <w:rPr>
+          <w:noProof/>
+        </w:rPr>
         <w:drawing>
           <wp:inline distT="0" distB="0" distL="0" distR="0" wp14:anchorId="240AD665" wp14:editId="0B670CB3">
             <wp:extent cx="5731510" cy="1470025"/>
@@ -286,6 +328,9 @@
     </w:p>
     <w:p>
       <w:r>
+        <w:rPr>
+          <w:noProof/>
+        </w:rPr>
         <w:drawing>
           <wp:inline distT="0" distB="0" distL="0" distR="0" wp14:anchorId="4D8B80CC" wp14:editId="7154C248">
             <wp:extent cx="5731510" cy="272415"/>
@@ -311,6 +356,49 @@
                     <a:xfrm>
                       <a:off x="0" y="0"/>
                       <a:ext cx="5731510" cy="272415"/>
+                    </a:xfrm>
+                    <a:prstGeom prst="rect">
+                      <a:avLst/>
+                    </a:prstGeom>
+                  </pic:spPr>
+                </pic:pic>
+              </a:graphicData>
+            </a:graphic>
+          </wp:inline>
+        </w:drawing>
+      </w:r>
+    </w:p>
+    <w:p>
+      <w:r>
+        <w:rPr>
+          <w:noProof/>
+        </w:rPr>
+        <w:lastRenderedPageBreak/>
+        <w:drawing>
+          <wp:inline distT="0" distB="0" distL="0" distR="0" wp14:anchorId="19A72F85" wp14:editId="34A17903">
+            <wp:extent cx="5731510" cy="2513965"/>
+            <wp:effectExtent l="0" t="0" r="2540" b="635"/>
+            <wp:docPr id="455381983" name="Picture 1"/>
+            <wp:cNvGraphicFramePr>
+              <a:graphicFrameLocks xmlns:a="http://schemas.openxmlformats.org/drawingml/2006/main" noChangeAspect="1"/>
+            </wp:cNvGraphicFramePr>
+            <a:graphic xmlns:a="http://schemas.openxmlformats.org/drawingml/2006/main">
+              <a:graphicData uri="http://schemas.openxmlformats.org/drawingml/2006/picture">
+                <pic:pic xmlns:pic="http://schemas.openxmlformats.org/drawingml/2006/picture">
+                  <pic:nvPicPr>
+                    <pic:cNvPr id="455381983" name=""/>
+                    <pic:cNvPicPr/>
+                  </pic:nvPicPr>
+                  <pic:blipFill>
+                    <a:blip r:embed="rId11"/>
+                    <a:stretch>
+                      <a:fillRect/>
+                    </a:stretch>
+                  </pic:blipFill>
+                  <pic:spPr>
+                    <a:xfrm>
+                      <a:off x="0" y="0"/>
+                      <a:ext cx="5731510" cy="2513965"/>
                     </a:xfrm>
                     <a:prstGeom prst="rect">
                       <a:avLst/>
@@ -936,6 +1024,7 @@
   <w:style w:type="character" w:default="1" w:styleId="DefaultParagraphFont">
     <w:name w:val="Default Paragraph Font"/>
     <w:uiPriority w:val="1"/>
+    <w:semiHidden/>
     <w:unhideWhenUsed/>
   </w:style>
   <w:style w:type="table" w:default="1" w:styleId="TableNormal">

</xml_diff>